<commit_message>
Alinear solución con el caso Manaco: entregables, diccionario, tabla depurada y prototipo
- Estaciones 1-4 reescritas según el caso: 6 áreas, hallazgos del Excel, SMART a 3 años, segmento y costos de alternativas
- Respuestas a las 5 preguntas de referencia del caso
- Tablero: diccionario de datos y descarga de la tabla depurada en Excel
- Documentación alineada con la limpieza actual (240 filas, claves repetidas marcadas)
- Prototipo: brecha con calzado equivalente, producción calibrada y colores cumple/no cumple
- Guía de defensa, README y seed_demo corregidos; 48 pruebas
</commit_message>
<xml_diff>
--- a/docs/Solucion_Manaco_Data.docx
+++ b/docs/Solucion_Manaco_Data.docx
@@ -582,10 +582,10 @@
           <w:b/>
           <w:color w:val="B3261E"/>
         </w:rPr>
-        <w:t xml:space="preserve">Caso real detectado por el sistema: </w:t>
+        <w:t xml:space="preserve">Ejemplo de la demo: </w:t>
       </w:r>
       <w:r>
-        <w:t>"Faltan 2 pares de MAN-DEP-001 en Tienda Prado (esperado 38, contado 36)" — una diferencia que antes solo se habría notado en el cierre contable mensual.</w:t>
+        <w:t>"Faltan 2 pares de MAN-DEP-001 en Tienda Prado (esperado 38, contado 36)" — una diferencia que sin control diario solo se notaría en el cierre contable mensual.</w:t>
       </w:r>
     </w:p>
     <w:p>
@@ -605,7 +605,7 @@
           <w:b w:val="0"/>
           <w:i w:val="0"/>
         </w:rPr>
-        <w:t>El módulo de ETL (src/services/etl.py) limpia el Excel de comercio exterior de calzado (240 filas originales → 230 válidas), documentando cada regla de limpieza en una bitácora. El Tablero de mercado cruza esos datos con las ventas internas por categoría, usando el código del Sistema Armonizado (SA6) para enlazar el catálogo interno con las categorías del comercio exterior.</w:t>
+        <w:t>El módulo de ETL (src/services/etl.py) limpia el Excel de comercio exterior de calzado (240 filas válidas; 20 comparten clave con otra fila y se marcan, sin descartarse), documentando cada regla de limpieza en una bitácora. El Tablero de mercado cruza esos datos con las ventas internas por categoría, usando el código del Sistema Armonizado (SA6) para enlazar el catálogo interno con las categorías del comercio exterior.</w:t>
       </w:r>
     </w:p>
     <w:p>
@@ -809,7 +809,7 @@
           <w:b w:val="0"/>
           <w:i w:val="0"/>
         </w:rPr>
-        <w:t>Un backtest compara el error del pronóstico ajustado contra el no ajustado (MAPE): el pronóstico ajustado por mercado informal obtiene un MAPE menor o igual, confirmando que ignorar la competencia informal sobreestima sistemáticamente la demanda formal.</w:t>
+        <w:t>Un backtest compara el error del pronóstico ajustado contra el no ajustado (MAPE). Como el historial simulado ya incluye el efecto del mercado informal, el backtest demuestra que el método funciona, pero no mide la magnitud real del contrabando: eso se valida con ventas reales.</w:t>
       </w:r>
     </w:p>
     <w:p>
@@ -1141,7 +1141,7 @@
                 <w:color w:val="FFFFFF"/>
                 <w:sz w:val="20"/>
               </w:rPr>
-              <w:t>Problema</w:t>
+              <w:t>Problema y área</w:t>
             </w:r>
           </w:p>
         </w:tc>
@@ -1189,7 +1189,7 @@
                 <w:b w:val="0"/>
                 <w:sz w:val="20"/>
               </w:rPr>
-              <w:t>Inventario sin control diario en tienda</w:t>
+              <w:t>Inventario sin control diario en tienda (producción, inventarios y logística)</w:t>
             </w:r>
           </w:p>
         </w:tc>
@@ -1204,7 +1204,7 @@
                 <w:b w:val="0"/>
                 <w:sz w:val="20"/>
               </w:rPr>
-              <w:t>La merma solo se nota en el cierre contable mensual sin una alerta diaria.</w:t>
+              <w:t>Sin conteo diario, una diferencia de stock solo se nota en el cierre contable mensual, cuando ya no se puede rastrear su causa.</w:t>
             </w:r>
           </w:p>
         </w:tc>
@@ -1236,7 +1236,7 @@
                 <w:b w:val="0"/>
                 <w:sz w:val="20"/>
               </w:rPr>
-              <w:t>Datos de mercado externo y ventas internas desintegrados</w:t>
+              <w:t>Presión de la oferta importada y del mercado informal (competitividad y mercado)</w:t>
             </w:r>
           </w:p>
         </w:tc>
@@ -1251,7 +1251,7 @@
                 <w:b w:val="0"/>
                 <w:sz w:val="20"/>
               </w:rPr>
-              <w:t>Deportivo importa ~3 veces lo que exporta: dependencia antes invisible.</w:t>
+              <w:t>Dato: Deportivo importa 2,97 veces lo que exporta. Hipótesis a validar: el calzado informal le quita ventas a Manaco.</w:t>
             </w:r>
           </w:p>
         </w:tc>
@@ -1283,7 +1283,7 @@
                 <w:b w:val="0"/>
                 <w:sz w:val="20"/>
               </w:rPr>
-              <w:t>Presión creciente del mercado informal / contrabando</w:t>
+              <w:t>Rentabilidad por línea sin medir (rentabilidad y costos)</w:t>
             </w:r>
           </w:p>
         </w:tc>
@@ -1298,7 +1298,7 @@
                 <w:b w:val="0"/>
                 <w:sz w:val="20"/>
               </w:rPr>
-              <w:t>El pronóstico sin ajustar sobreestima la demanda real.</w:t>
+              <w:t>El Cuero vale casi el doble por par en el mercado de referencia, pero Manaco no integra sus costos para saber qué línea le deja más utilidad.</w:t>
             </w:r>
           </w:p>
         </w:tc>
@@ -1330,7 +1330,7 @@
                 <w:b w:val="0"/>
                 <w:sz w:val="20"/>
               </w:rPr>
-              <w:t>Producción sin cobertura ni calidad garantizadas</w:t>
+              <w:t>Cliente desconocido (clientes, segmentación y marketing)</w:t>
             </w:r>
           </w:p>
         </w:tc>
@@ -1345,7 +1345,7 @@
                 <w:b w:val="0"/>
                 <w:sz w:val="20"/>
               </w:rPr>
-              <w:t>El escenario puede mostrar defectos sobre meta y cobertura bajo el 100%.</w:t>
+              <w:t>El sistema registra qué se vende, dónde y cuándo, pero no quién compra: no se puede segmentar ni medir el canal digital.</w:t>
             </w:r>
           </w:p>
         </w:tc>
@@ -1377,7 +1377,7 @@
                 <w:b w:val="0"/>
                 <w:sz w:val="20"/>
               </w:rPr>
-              <w:t>Calidad de la ingesta de datos de sucursales</w:t>
+              <w:t>Datos dispersos y sin responsables claros (gestión organizacional y calidad de datos)</w:t>
             </w:r>
           </w:p>
         </w:tc>
@@ -1392,13 +1392,22 @@
                 <w:b w:val="0"/>
                 <w:sz w:val="20"/>
               </w:rPr>
-              <w:t>Errores en los archivos de sucursal distorsionan los reportes de gerencia.</w:t>
+              <w:t>Mercado, ventas, inventario y calidad están separados, y los archivos de sucursal llegan con errores.</w:t>
             </w:r>
           </w:p>
         </w:tc>
       </w:tr>
     </w:tbl>
     <w:p/>
+    <w:p>
+      <w:r>
+        <w:rPr>
+          <w:b w:val="0"/>
+          <w:i w:val="0"/>
+        </w:rPr>
+        <w:t>El Excel de comercio exterior responde comparaciones de categorías, socios y valor por par en un mercado de referencia; no responde costos, márgenes, clientes ni ventas de Manaco: eso exige datos internos.</w:t>
+      </w:r>
+    </w:p>
     <w:p>
       <w:pPr>
         <w:pStyle w:val="Heading1"/>
@@ -1426,7 +1435,7 @@
         <w:pStyle w:val="ListNumber"/>
       </w:pPr>
       <w:r>
-        <w:t>El control de inventario pasa de reactivo a preventivo: el sistema genera una alerta inmediata en vez de descubrir la merma en el cierre contable.</w:t>
+        <w:t>Deportivo es la categoría más dependiente de la importación: importa 2,97 veces lo que exporta en valor y 2,91 veces en pares. Como la proporción casi no cambia con la métrica, la conclusión es sólida.</w:t>
       </w:r>
     </w:p>
     <w:p>
@@ -1434,7 +1443,7 @@
         <w:pStyle w:val="ListNumber"/>
       </w:pPr>
       <w:r>
-        <w:t>Deportivo es la línea más expuesta a la oferta externa y a la sensibilidad del mercado informal (0.35 frente a 0.20 y 0.10).</w:t>
+        <w:t>El calzado de cuero es un nicho de mayor valor por par: unos 41–45 USD por par frente a unos 25 USD de las otras dos categorías. Es pequeño en volumen, pero cada par vale casi el doble: es donde conviene diferenciarse por calidad y no por precio.</w:t>
       </w:r>
     </w:p>
     <w:p>
@@ -1442,7 +1451,7 @@
         <w:pStyle w:val="ListNumber"/>
       </w:pPr>
       <w:r>
-        <w:t>Ajustar el pronóstico por presión informal reduce el error (MAPE), no lo aumenta: ignorar la competencia informal sobreestima la demanda formal.</w:t>
+        <w:t>Medir por valor o por cantidad cambia quiénes son los proveedores relevantes: por categoría el orden no cambia, pero República Checa entra al top 6 de proveedores por pares y no por valor, porque su calzado es el más barato de la base (unos 9 USD por par).</w:t>
       </w:r>
     </w:p>
     <w:p>
@@ -1461,7 +1470,7 @@
         <w:pStyle w:val="ListNumber"/>
       </w:pPr>
       <w:r>
-        <w:t>La referencia de comercio exterior usada es española, no boliviana, y es un valor aduanero, no el precio al consumidor.</w:t>
+        <w:t>La referencia es española y el valor es aduanero: sirve para comparar categorías y proporciones, pero no representa el mercado boliviano ni el precio al consumidor, que incluye aranceles, transporte y margen del comerciante.</w:t>
       </w:r>
     </w:p>
     <w:p>
@@ -1469,7 +1478,7 @@
         <w:pStyle w:val="ListNumber"/>
       </w:pPr>
       <w:r>
-        <w:t>El pronóstico y el prototipo de escenario corren sobre datos simulados; el sistema real solo tiene ~30 días de ventas, insuficiente para estimar estacionalidad con rigor estadístico.</w:t>
+        <w:t>La cobertura por año es desigual (28 registros en 2020 y 82 en 2024): cualquier crecimiento entre años refleja la cantidad de registros, no el mercado, por lo que no se sacan tendencias temporales.</w:t>
       </w:r>
     </w:p>
     <w:p>
@@ -1489,9 +1498,226 @@
           <w:b w:val="0"/>
           <w:i/>
         </w:rPr>
-        <w:t>¿Qué mezcla de producción por línea debe planificar Manaco para los próximos 6 meses si la presión del mercado informal sigue la trayectoria actual del tipo de cambio paralelo, y qué tanto de la brecha de precio frente a ese mercado informal está dispuesta a absorber sin sacrificar margen?</w:t>
+        <w:t>Si Deportivo es la línea con más presión importada y Cuero la de mayor valor por par, ¿debe Manaco defender volumen en Deportivo o concentrar su diferenciación en Cuero? ¿Qué margen real por línea necesitaría ver para decidirlo?</w:t>
       </w:r>
     </w:p>
+    <w:p>
+      <w:pPr>
+        <w:pStyle w:val="Heading2"/>
+      </w:pPr>
+      <w:r>
+        <w:rPr>
+          <w:color w:val="57534E"/>
+        </w:rPr>
+        <w:t>Respuestas a las 5 preguntas del caso</w:t>
+      </w:r>
+    </w:p>
+    <w:tbl>
+      <w:tblPr>
+        <w:tblStyle w:val="LightGrid-Accent1"/>
+        <w:tblW w:type="auto" w:w="0"/>
+        <w:tblLook w:firstColumn="1" w:firstRow="1" w:lastColumn="0" w:lastRow="0" w:noHBand="0" w:noVBand="1" w:val="04A0"/>
+      </w:tblPr>
+      <w:tblGrid>
+        <w:gridCol w:w="4320"/>
+        <w:gridCol w:w="4320"/>
+      </w:tblGrid>
+      <w:tr>
+        <w:tc>
+          <w:tcPr>
+            <w:tcW w:type="dxa" w:w="4320"/>
+          </w:tcPr>
+          <w:p>
+            <w:r/>
+            <w:r>
+              <w:rPr>
+                <w:b/>
+                <w:color w:val="FFFFFF"/>
+                <w:sz w:val="20"/>
+              </w:rPr>
+              <w:t>Pregunta del caso</w:t>
+            </w:r>
+          </w:p>
+        </w:tc>
+        <w:tc>
+          <w:tcPr>
+            <w:tcW w:type="dxa" w:w="4320"/>
+          </w:tcPr>
+          <w:p>
+            <w:r/>
+            <w:r>
+              <w:rPr>
+                <w:b/>
+                <w:color w:val="FFFFFF"/>
+                <w:sz w:val="20"/>
+              </w:rPr>
+              <w:t>Respuesta con los datos</w:t>
+            </w:r>
+          </w:p>
+        </w:tc>
+      </w:tr>
+      <w:tr>
+        <w:tc>
+          <w:tcPr>
+            <w:tcW w:type="dxa" w:w="4320"/>
+          </w:tcPr>
+          <w:p>
+            <w:r/>
+            <w:r>
+              <w:rPr>
+                <w:b w:val="0"/>
+                <w:sz w:val="20"/>
+              </w:rPr>
+              <w:t>¿Qué datos internos debería recopilar Manaco?</w:t>
+            </w:r>
+          </w:p>
+        </w:tc>
+        <w:tc>
+          <w:tcPr>
+            <w:tcW w:type="dxa" w:w="4320"/>
+          </w:tcPr>
+          <w:p>
+            <w:r/>
+            <w:r>
+              <w:rPr>
+                <w:b w:val="0"/>
+                <w:sz w:val="20"/>
+              </w:rPr>
+              <w:t>Ventas por producto, tienda y día (ya las registra el sistema); costos reales por lote; defectos y devoluciones con su motivo; datos del cliente (segmento, ciudad y canal); fechas de entrega; inventario por almacén; y precios reales con descuentos.</w:t>
+            </w:r>
+          </w:p>
+        </w:tc>
+      </w:tr>
+      <w:tr>
+        <w:tc>
+          <w:tcPr>
+            <w:tcW w:type="dxa" w:w="4320"/>
+          </w:tcPr>
+          <w:p>
+            <w:r/>
+            <w:r>
+              <w:rPr>
+                <w:b w:val="0"/>
+                <w:sz w:val="20"/>
+              </w:rPr>
+              <w:t>¿Qué hipótesis sobre competencia, abastecimiento o diferenciación podría investigar?</w:t>
+            </w:r>
+          </w:p>
+        </w:tc>
+        <w:tc>
+          <w:tcPr>
+            <w:tcW w:type="dxa" w:w="4320"/>
+          </w:tcPr>
+          <w:p>
+            <w:r/>
+            <w:r>
+              <w:rPr>
+                <w:b w:val="0"/>
+                <w:sz w:val="20"/>
+              </w:rPr>
+              <w:t>Competencia: Deportivo depende de la importación (importa 2,97 veces lo que exporta), así que es la línea más expuesta al calzado importado barato. Abastecimiento: hay proveedores muy baratos por par (República Checa, unos 9 USD) que sirven de referencia de costo. Diferenciación: el Cuero vale casi el doble por par, lo que sugiere un nicho de calidad.</w:t>
+            </w:r>
+          </w:p>
+        </w:tc>
+      </w:tr>
+      <w:tr>
+        <w:tc>
+          <w:tcPr>
+            <w:tcW w:type="dxa" w:w="4320"/>
+          </w:tcPr>
+          <w:p>
+            <w:r/>
+            <w:r>
+              <w:rPr>
+                <w:b w:val="0"/>
+                <w:sz w:val="20"/>
+              </w:rPr>
+              <w:t>¿Cómo varía el valor por par y por qué no es el precio al consumidor?</w:t>
+            </w:r>
+          </w:p>
+        </w:tc>
+        <w:tc>
+          <w:tcPr>
+            <w:tcW w:type="dxa" w:w="4320"/>
+          </w:tcPr>
+          <w:p>
+            <w:r/>
+            <w:r>
+              <w:rPr>
+                <w:b w:val="0"/>
+                <w:sz w:val="20"/>
+              </w:rPr>
+              <w:t>Va de 8 a 119 USD por registro; la mediana es de unos 47 USD en Cuero y unos 27 USD en Deportivo y en Caucho y cuero. Es un valor aduanero: no incluye aranceles, impuestos, transporte ni el margen del comerciante, así que el precio en tienda es mayor.</w:t>
+            </w:r>
+          </w:p>
+        </w:tc>
+      </w:tr>
+      <w:tr>
+        <w:tc>
+          <w:tcPr>
+            <w:tcW w:type="dxa" w:w="4320"/>
+          </w:tcPr>
+          <w:p>
+            <w:r/>
+            <w:r>
+              <w:rPr>
+                <w:b w:val="0"/>
+                <w:sz w:val="20"/>
+              </w:rPr>
+              <w:t>¿Qué países son proveedores y destinos relevantes?</w:t>
+            </w:r>
+          </w:p>
+        </w:tc>
+        <w:tc>
+          <w:tcPr>
+            <w:tcW w:type="dxa" w:w="4320"/>
+          </w:tcPr>
+          <w:p>
+            <w:r/>
+            <w:r>
+              <w:rPr>
+                <w:b w:val="0"/>
+                <w:sz w:val="20"/>
+              </w:rPr>
+              <w:t>Proveedores, por valor: Grecia, Países Bajos, Vietnam, Irlanda, Turquía y Rumanía. Destinos, por valor: Indonesia, Vietnam, Eslovenia, Irlanda, Grecia y Austria. Son relevantes dentro de los 30 socios del archivo, no del comercio mundial.</w:t>
+            </w:r>
+          </w:p>
+        </w:tc>
+      </w:tr>
+      <w:tr>
+        <w:tc>
+          <w:tcPr>
+            <w:tcW w:type="dxa" w:w="4320"/>
+          </w:tcPr>
+          <w:p>
+            <w:r/>
+            <w:r>
+              <w:rPr>
+                <w:b w:val="0"/>
+                <w:sz w:val="20"/>
+              </w:rPr>
+              <w:t>¿Qué categorías tienen mayor valor? ¿Cambia al comparar con la cantidad?</w:t>
+            </w:r>
+          </w:p>
+        </w:tc>
+        <w:tc>
+          <w:tcPr>
+            <w:tcW w:type="dxa" w:w="4320"/>
+          </w:tcPr>
+          <w:p>
+            <w:r/>
+            <w:r>
+              <w:rPr>
+                <w:b w:val="0"/>
+                <w:sz w:val="20"/>
+              </w:rPr>
+              <w:t>Caucho y cuero lidera en ambos flujos (11.709,7 M USD importados y 8.514,2 M USD exportados), seguida de Deportivo; Cuero es muy pequeña. Por categoría el orden no cambia con la cantidad de pares; por socio sí: República Checa entra al top 6 de proveedores por pares, pero no por valor.</w:t>
+            </w:r>
+          </w:p>
+        </w:tc>
+      </w:tr>
+    </w:tbl>
+    <w:p/>
     <w:p>
       <w:pPr>
         <w:pStyle w:val="Heading1"/>
@@ -1574,7 +1800,7 @@
                 <w:b w:val="0"/>
                 <w:sz w:val="20"/>
               </w:rPr>
-              <w:t>Manaco pierde control del inventario diario en tienda y no integra sus datos internos con el mercado externo.</w:t>
+              <w:t>Manaco no controla a diario su inventario ni mide la rentabilidad real de cada línea, y no cruza esos datos con el mercado.</w:t>
             </w:r>
           </w:p>
         </w:tc>
@@ -1591,7 +1817,7 @@
                 <w:b w:val="0"/>
                 <w:sz w:val="20"/>
               </w:rPr>
-              <w:t>Solución</w:t>
+              <w:t>Solución analítica</w:t>
             </w:r>
           </w:p>
         </w:tc>
@@ -1606,7 +1832,7 @@
                 <w:b w:val="0"/>
                 <w:sz w:val="20"/>
               </w:rPr>
-              <w:t>Manaco Data: control diario con alertas, tablero de mercado cruzado, y pronóstico ajustado con prototipo de escenario.</w:t>
+              <w:t>Manaco Data: control diario con alertas, tablero de mercado cruzado por código SA6, y pronóstico con prototipo de escenario (hoy con datos [Simulado]). Apoya la decisión de qué línea priorizar y cuánto producir.</w:t>
             </w:r>
           </w:p>
         </w:tc>
@@ -1623,7 +1849,7 @@
                 <w:b w:val="0"/>
                 <w:sz w:val="20"/>
               </w:rPr>
-              <w:t>Objetivo 1 (SMART)</w:t>
+              <w:t>Datos que necesita</w:t>
             </w:r>
           </w:p>
         </w:tc>
@@ -1638,7 +1864,7 @@
                 <w:b w:val="0"/>
                 <w:sz w:val="20"/>
               </w:rPr>
-              <w:t>Reducir a menos del 5% los cierres con diferencia por tienda en 3 meses.</w:t>
+              <w:t>Aperturas, ventas y cierres diarios (ya registrados); comercio exterior (ya limpio); costos, defectos y devoluciones por lote (por reemplazar con datos reales).</w:t>
             </w:r>
           </w:p>
         </w:tc>
@@ -1655,7 +1881,7 @@
                 <w:b w:val="0"/>
                 <w:sz w:val="20"/>
               </w:rPr>
-              <w:t>Objetivo 2 (SMART)</w:t>
+              <w:t>Objetivo 1 — Inventario</w:t>
             </w:r>
           </w:p>
         </w:tc>
@@ -1670,7 +1896,7 @@
                 <w:b w:val="0"/>
                 <w:sz w:val="20"/>
               </w:rPr>
-              <w:t>100% de las tiendas registrando apertura, venta y cierre a diario en el primer mes.</w:t>
+              <w:t>Cierres con diferencia por debajo del 10% al año 1, del 5% al año 2 y del 3% al año 3. KPI: % de cierres Correcto por tienda.</w:t>
             </w:r>
           </w:p>
         </w:tc>
@@ -1687,7 +1913,7 @@
                 <w:b w:val="0"/>
                 <w:sz w:val="20"/>
               </w:rPr>
-              <w:t>Objetivo 3 (SMART)</w:t>
+              <w:t>Objetivo 2 — Datos reales</w:t>
             </w:r>
           </w:p>
         </w:tc>
@@ -1702,7 +1928,39 @@
                 <w:b w:val="0"/>
                 <w:sz w:val="20"/>
               </w:rPr>
-              <w:t>Mantener el MAPE ajustado por mercado informal por debajo del MAPE sin ajustar, cada mes.</w:t>
+              <w:t>100% de tiendas con registro diario desde el mes 3; 24 meses de historia real al año 2; MAPE menor al 15% al año 3. KPI: % de tiendas con registro completo, meses de historia real y MAPE.</w:t>
+            </w:r>
+          </w:p>
+        </w:tc>
+      </w:tr>
+      <w:tr>
+        <w:tc>
+          <w:tcPr>
+            <w:tcW w:type="dxa" w:w="4320"/>
+          </w:tcPr>
+          <w:p>
+            <w:r/>
+            <w:r>
+              <w:rPr>
+                <w:b w:val="0"/>
+                <w:sz w:val="20"/>
+              </w:rPr>
+              <w:t>Objetivo 3 — Calidad</w:t>
+            </w:r>
+          </w:p>
+        </w:tc>
+        <w:tc>
+          <w:tcPr>
+            <w:tcW w:type="dxa" w:w="4320"/>
+          </w:tcPr>
+          <w:p>
+            <w:r/>
+            <w:r>
+              <w:rPr>
+                <w:b w:val="0"/>
+                <w:sz w:val="20"/>
+              </w:rPr>
+              <w:t>Defectos de 3% o menos al año 1, 2,5% al año 2 y 2% al año 3; devoluciones por costura y pegado reducidas a la mitad. KPI: tasa de defectos y devoluciones por lote.</w:t>
             </w:r>
           </w:p>
         </w:tc>
@@ -1734,7 +1992,7 @@
                 <w:b w:val="0"/>
                 <w:sz w:val="20"/>
               </w:rPr>
-              <w:t>Gerencia comercial, Encargado de tienda, Administrador/TI.</w:t>
+              <w:t>Gerencia General (comité mensual), Gerencia Comercial, Gerencia de Producción, encargados de tienda y Administración/TI.</w:t>
             </w:r>
           </w:p>
         </w:tc>
@@ -1751,7 +2009,7 @@
                 <w:b w:val="0"/>
                 <w:sz w:val="20"/>
               </w:rPr>
-              <w:t>Riesgos</w:t>
+              <w:t>Riesgo 1 y mitigación</w:t>
             </w:r>
           </w:p>
         </w:tc>
@@ -1766,7 +2024,71 @@
                 <w:b w:val="0"/>
                 <w:sz w:val="20"/>
               </w:rPr>
-              <w:t>Falta de disciplina en el registro diario; fallos del conteo por foto; decisiones sobre datos simulados sin validar; límite de escala de SQLite.</w:t>
+              <w:t>Registro diario incompleto: el cierre de inventario se suma al cierre de caja, con reporte semanal por tienda.</w:t>
+            </w:r>
+          </w:p>
+        </w:tc>
+      </w:tr>
+      <w:tr>
+        <w:tc>
+          <w:tcPr>
+            <w:tcW w:type="dxa" w:w="4320"/>
+          </w:tcPr>
+          <w:p>
+            <w:r/>
+            <w:r>
+              <w:rPr>
+                <w:b w:val="0"/>
+                <w:sz w:val="20"/>
+              </w:rPr>
+              <w:t>Riesgo 2 y mitigación</w:t>
+            </w:r>
+          </w:p>
+        </w:tc>
+        <w:tc>
+          <w:tcPr>
+            <w:tcW w:type="dxa" w:w="4320"/>
+          </w:tcPr>
+          <w:p>
+            <w:r/>
+            <w:r>
+              <w:rPr>
+                <w:b w:val="0"/>
+                <w:sz w:val="20"/>
+              </w:rPr>
+              <w:t>Decidir con datos simulados: etiqueta [Simulado], sin comprometer presupuesto hasta tener 12 meses reales.</w:t>
+            </w:r>
+          </w:p>
+        </w:tc>
+      </w:tr>
+      <w:tr>
+        <w:tc>
+          <w:tcPr>
+            <w:tcW w:type="dxa" w:w="4320"/>
+          </w:tcPr>
+          <w:p>
+            <w:r/>
+            <w:r>
+              <w:rPr>
+                <w:b w:val="0"/>
+                <w:sz w:val="20"/>
+              </w:rPr>
+              <w:t>Viabilidad</w:t>
+            </w:r>
+          </w:p>
+        </w:tc>
+        <w:tc>
+          <w:tcPr>
+            <w:tcW w:type="dxa" w:w="4320"/>
+          </w:tcPr>
+          <w:p>
+            <w:r/>
+            <w:r>
+              <w:rPr>
+                <w:b w:val="0"/>
+                <w:sz w:val="20"/>
+              </w:rPr>
+              <w:t>El sistema ya funciona en local; el costo principal es el tiempo del personal y la migración a PostgreSQL en el año 2.</w:t>
             </w:r>
           </w:p>
         </w:tc>
@@ -1782,6 +2104,66 @@
           <w:color w:val="B3261E"/>
         </w:rPr>
         <w:t>7. Recomendación ejecutiva</w:t>
+      </w:r>
+    </w:p>
+    <w:p>
+      <w:pPr>
+        <w:pStyle w:val="Heading2"/>
+      </w:pPr>
+      <w:r>
+        <w:rPr>
+          <w:color w:val="57534E"/>
+        </w:rPr>
+        <w:t>Lectura de los indicadores</w:t>
+      </w:r>
+    </w:p>
+    <w:p>
+      <w:pPr>
+        <w:pStyle w:val="ListBullet"/>
+      </w:pPr>
+      <w:r>
+        <w:t>Producción [Simulado]: lotes mensuales calibrados con la demanda base de cada línea (±15%).</w:t>
+      </w:r>
+    </w:p>
+    <w:p>
+      <w:pPr>
+        <w:pStyle w:val="ListBullet"/>
+      </w:pPr>
+      <w:r>
+        <w:t>Defectos [Simulado]: entre 1% y 5% por lote; cerca de la mitad de los lotes supera la meta de 3%.</w:t>
+      </w:r>
+    </w:p>
+    <w:p>
+      <w:pPr>
+        <w:pStyle w:val="ListBullet"/>
+      </w:pPr>
+      <w:r>
+        <w:t>Devoluciones [Simulado]: entre el 20% y el 50% de los pares defectuosos vuelven del cliente.</w:t>
+      </w:r>
+    </w:p>
+    <w:p>
+      <w:pPr>
+        <w:pStyle w:val="ListBullet"/>
+      </w:pPr>
+      <w:r>
+        <w:t>Entregas: no hay datos; el sistema no registra fechas de despacho ni de entrega.</w:t>
+      </w:r>
+    </w:p>
+    <w:p>
+      <w:pPr>
+        <w:pStyle w:val="ListBullet"/>
+      </w:pPr>
+      <w:r>
+        <w:t>Margen de catálogo [Supuesto]: cerca del 45% en las tres líneas, pero el Cuero deja unos 239 Bs por par frente a unos 155 Bs de las otras dos.</w:t>
+      </w:r>
+    </w:p>
+    <w:p>
+      <w:r>
+        <w:rPr>
+          <w:b w:val="0"/>
+          <w:i w:val="0"/>
+        </w:rPr>
+        <w:t>Falta para estimar rentabilidad: costos reales por lote, costos fijos, costo de cada devolución, gastos de almacenamiento y distribución, precio real con descuentos y fechas de entrega.</w:t>
       </w:r>
     </w:p>
     <w:tbl>
@@ -1839,7 +2221,7 @@
                 <w:color w:val="FFFFFF"/>
                 <w:sz w:val="20"/>
               </w:rPr>
-              <w:t>Alternativa B — Diferenciar por calidad y disponibilidad</w:t>
+              <w:t>Alternativa B — Diferenciar por calidad en Cuero</w:t>
             </w:r>
           </w:p>
         </w:tc>
@@ -1886,7 +2268,101 @@
                 <w:b w:val="0"/>
                 <w:sz w:val="20"/>
               </w:rPr>
-              <w:t>Mantener precio; bajar defectos y asegurar cobertura.</w:t>
+              <w:t>Mantener precio; control de calidad por lote y garantía en Cuero.</w:t>
+            </w:r>
+          </w:p>
+        </w:tc>
+      </w:tr>
+      <w:tr>
+        <w:tc>
+          <w:tcPr>
+            <w:tcW w:type="dxa" w:w="2880"/>
+          </w:tcPr>
+          <w:p>
+            <w:r/>
+            <w:r>
+              <w:rPr>
+                <w:b w:val="0"/>
+                <w:sz w:val="20"/>
+              </w:rPr>
+              <w:t>Beneficio</w:t>
+            </w:r>
+          </w:p>
+        </w:tc>
+        <w:tc>
+          <w:tcPr>
+            <w:tcW w:type="dxa" w:w="2880"/>
+          </w:tcPr>
+          <w:p>
+            <w:r/>
+            <w:r>
+              <w:rPr>
+                <w:b w:val="0"/>
+                <w:sz w:val="20"/>
+              </w:rPr>
+              <w:t>Recuperar volumen.</w:t>
+            </w:r>
+          </w:p>
+        </w:tc>
+        <w:tc>
+          <w:tcPr>
+            <w:tcW w:type="dxa" w:w="2880"/>
+          </w:tcPr>
+          <w:p>
+            <w:r/>
+            <w:r>
+              <w:rPr>
+                <w:b w:val="0"/>
+                <w:sz w:val="20"/>
+              </w:rPr>
+              <w:t>Menos devoluciones; marca más fuerte en la línea de mayor valor por par.</w:t>
+            </w:r>
+          </w:p>
+        </w:tc>
+      </w:tr>
+      <w:tr>
+        <w:tc>
+          <w:tcPr>
+            <w:tcW w:type="dxa" w:w="2880"/>
+          </w:tcPr>
+          <w:p>
+            <w:r/>
+            <w:r>
+              <w:rPr>
+                <w:b w:val="0"/>
+                <w:sz w:val="20"/>
+              </w:rPr>
+              <w:t>Costo</w:t>
+            </w:r>
+          </w:p>
+        </w:tc>
+        <w:tc>
+          <w:tcPr>
+            <w:tcW w:type="dxa" w:w="2880"/>
+          </w:tcPr>
+          <w:p>
+            <w:r/>
+            <w:r>
+              <w:rPr>
+                <w:b w:val="0"/>
+                <w:sz w:val="20"/>
+              </w:rPr>
+              <w:t>Con margen de ~45%, bajar 10% el precio exige ~29% más pares para mantener la utilidad bruta.</w:t>
+            </w:r>
+          </w:p>
+        </w:tc>
+        <w:tc>
+          <w:tcPr>
+            <w:tcW w:type="dxa" w:w="2880"/>
+          </w:tcPr>
+          <w:p>
+            <w:r/>
+            <w:r>
+              <w:rPr>
+                <w:b w:val="0"/>
+                <w:sz w:val="20"/>
+              </w:rPr>
+              <w:t>Inspección por lote, capacitación y stock de tallas; se cuantifica con costos reales.</w:t>
             </w:r>
           </w:p>
         </w:tc>
@@ -1918,7 +2394,7 @@
                 <w:b w:val="0"/>
                 <w:sz w:val="20"/>
               </w:rPr>
-              <w:t>Baja (depende del tipo de cambio paralelo).</w:t>
+              <w:t>Bajo (depende del tipo de cambio paralelo).</w:t>
             </w:r>
           </w:p>
         </w:tc>
@@ -1933,7 +2409,7 @@
                 <w:b w:val="0"/>
                 <w:sz w:val="20"/>
               </w:rPr>
-              <w:t>Alta (procesos internos de producción).</w:t>
+              <w:t>Alto (procesos internos).</w:t>
             </w:r>
           </w:p>
         </w:tc>
@@ -1965,7 +2441,7 @@
                 <w:b w:val="0"/>
                 <w:sz w:val="20"/>
               </w:rPr>
-              <w:t>Guerra de precios sin los costos formales del competidor informal.</w:t>
+              <w:t>Guerra de precios contra un competidor sin costos formales.</w:t>
             </w:r>
           </w:p>
         </w:tc>
@@ -1980,7 +2456,7 @@
                 <w:b w:val="0"/>
                 <w:sz w:val="20"/>
               </w:rPr>
-              <w:t>Que la diferenciación no se perciba si no se comunica.</w:t>
+              <w:t>Que la garantía no se perciba si no se comunica.</w:t>
             </w:r>
           </w:p>
         </w:tc>
@@ -1993,10 +2469,39 @@
           <w:b/>
           <w:color w:val="B3261E"/>
         </w:rPr>
-        <w:t xml:space="preserve">Acción comercial recomendada: </w:t>
+        <w:t xml:space="preserve">Recomendación: Alternativa B: </w:t>
       </w:r>
       <w:r>
-        <w:t>Alternativa B — Diferenciar por calidad y disponibilidad. La brecha de precio depende del tipo de cambio paralelo, fuera del control de Manaco; la tasa de defectos y la cobertura de producción son palancas internas que ya se miden mes a mes en el Prototipo de escenario.</w:t>
+        <w:t>La brecha de precio depende del tipo de cambio paralelo, fuera del control de Manaco, y un 10% menos de precio exige casi un 30% más de volumen solo para quedar igual. La calidad es una palanca interna, y el Cuero es la línea donde el mercado paga más por par.</w:t>
+      </w:r>
+    </w:p>
+    <w:p>
+      <w:pPr>
+        <w:pStyle w:val="Heading2"/>
+      </w:pPr>
+      <w:r>
+        <w:rPr>
+          <w:color w:val="57534E"/>
+        </w:rPr>
+        <w:t>Segmento y acción comercial</w:t>
+      </w:r>
+    </w:p>
+    <w:p>
+      <w:r>
+        <w:rPr>
+          <w:b w:val="0"/>
+          <w:i w:val="0"/>
+        </w:rPr>
+        <w:t>Segmento [Supuesto]: adultos que trabajan en oficinas o servicios y compran calzado de cuero de vestir en las tiendas de La Paz, Cochabamba y Santa Cruz. El Cuero tiene el mayor valor por par, la menor presión importada (1,52 frente a 2,97 de Deportivo) y el mayor margen por par del catálogo.</w:t>
+      </w:r>
+    </w:p>
+    <w:p>
+      <w:r>
+        <w:rPr>
+          <w:b w:val="0"/>
+          <w:i w:val="0"/>
+        </w:rPr>
+        <w:t>Acción: lanzar "Cuero garantizado", con garantía de 6 meses en costura y suela, control de calidad de cada lote y stock asegurado de tallas centrales en las 3 tiendas.</w:t>
       </w:r>
     </w:p>
     <w:p>
@@ -2015,7 +2520,7 @@
         <w:pStyle w:val="ListNumber"/>
       </w:pPr>
       <w:r>
-        <w:t>Cobertura de producción vs. demanda proyectada (meta ≥100%).</w:t>
+        <w:t>Tasa de defectos y devoluciones de la línea Cuero (meta ≤3% de defectos).</w:t>
       </w:r>
     </w:p>
     <w:p>
@@ -2023,7 +2528,7 @@
         <w:pStyle w:val="ListNumber"/>
       </w:pPr>
       <w:r>
-        <w:t>Tasa de defectos de producción (meta ≤3%).</w:t>
+        <w:t>Ventas de la línea Cuero en pares y Bs frente a los 3 meses previos.</w:t>
       </w:r>
     </w:p>
     <w:p>
@@ -2051,7 +2556,7 @@
           <w:b w:val="0"/>
           <w:i w:val="0"/>
         </w:rPr>
-        <w:t>Los datos de inventario y comercio exterior son reales y ya están limpios en el sistema. Los datos de producción, calidad y mercado local provienen del pronóstico y el prototipo de escenario, y están explícitamente etiquetados [Simulado] o [Supuesto] en el código. Antes de comprometer presupuesto real con los objetivos de este documento, deben reemplazarse por historia real de Manaco.</w:t>
+        <w:t>Los datos de comercio exterior son reales y ya están limpios en el sistema. Las ventas e inventario vienen de la demo, y los datos de producción, calidad, mercado local y precios de catálogo están explícitamente etiquetados [Simulado] o [Supuesto]. Antes de comprometer presupuesto real con los objetivos de este documento, deben reemplazarse por historia real de Manaco.</w:t>
       </w:r>
     </w:p>
     <w:p>

</xml_diff>